<commit_message>
docs: highlight military transition and cloud SOC investigations
</commit_message>
<xml_diff>
--- a/assets/Brandon_Love_Cybersecurity_Resume.docx
+++ b/assets/Brandon_Love_Cybersecurity_Resume.docx
@@ -72,9 +72,9 @@
         <w:rPr>
           <w:rFonts w:ascii="Arial" w:hAnsi="Arial"/>
           <w:color w:val="1F2937"/>
-          <w:sz w:val="18"/>
+          <w:sz w:val="21"/>
         </w:rPr>
-        <w:t>Cybersecurity analyst with hands-on experience building and operating SIEM, endpoint-monitoring, and detection workflows across Microsoft Sentinel, Microsoft Defender, Wazuh, Windows, Linux, and network telemetry. Investigates alerts, hunts threats with KQL, analyzes endpoint and packet evidence, and documents repeatable response procedures. U.S. Army Staff Sergeant with 12+ years of leadership, operational risk management, and mission-focused decision-making under pressure.</w:t>
+        <w:t>Military professional and U.S. Army Staff Sergeant transitioning into cybersecurity, bringing 12+ years of leadership, risk assessment, and disciplined operational decision-making. Builds hands-on SOC labs, investigates SIEM alerts, correlates authentication and endpoint activity, and documents evidence-based findings. Experience with Wazuh, Microsoft Sentinel, Microsoft Defender, KQL, Python, and Linux; seeking a cybersecurity analyst role focused on detection, investigation, and response.</w:t>
       </w:r>
     </w:p>
     <w:p>
@@ -104,7 +104,7 @@
           <w:rFonts w:ascii="Arial" w:hAnsi="Arial"/>
           <w:b/>
           <w:color w:val="1F2937"/>
-          <w:sz w:val="18"/>
+          <w:sz w:val="21"/>
         </w:rPr>
         <w:t>SOC Operations:</w:t>
       </w:r>
@@ -112,7 +112,7 @@
         <w:rPr>
           <w:rFonts w:ascii="Arial" w:hAnsi="Arial"/>
           <w:color w:val="1F2937"/>
-          <w:sz w:val="18"/>
+          <w:sz w:val="21"/>
         </w:rPr>
         <w:t xml:space="preserve"> Alert triage • Incident investigation • Threat hunting • Incident response • Detection engineering • Log analysis • Vulnerability management • Technical reporting</w:t>
       </w:r>
@@ -126,7 +126,7 @@
           <w:rFonts w:ascii="Arial" w:hAnsi="Arial"/>
           <w:b/>
           <w:color w:val="1F2937"/>
-          <w:sz w:val="18"/>
+          <w:sz w:val="21"/>
         </w:rPr>
         <w:t>Platforms &amp; Tools:</w:t>
       </w:r>
@@ -134,7 +134,7 @@
         <w:rPr>
           <w:rFonts w:ascii="Arial" w:hAnsi="Arial"/>
           <w:color w:val="1F2937"/>
-          <w:sz w:val="18"/>
+          <w:sz w:val="21"/>
         </w:rPr>
         <w:t xml:space="preserve"> Microsoft Sentinel • Microsoft Defender • Wazuh • Log Analytics • KQL • Sysmon • Wireshark/TShark • VirusTotal • GitHub Actions</w:t>
       </w:r>
@@ -148,7 +148,7 @@
           <w:rFonts w:ascii="Arial" w:hAnsi="Arial"/>
           <w:b/>
           <w:color w:val="1F2937"/>
-          <w:sz w:val="18"/>
+          <w:sz w:val="21"/>
         </w:rPr>
         <w:t>Technical:</w:t>
       </w:r>
@@ -156,7 +156,7 @@
         <w:rPr>
           <w:rFonts w:ascii="Arial" w:hAnsi="Arial"/>
           <w:color w:val="1F2937"/>
-          <w:sz w:val="18"/>
+          <w:sz w:val="21"/>
         </w:rPr>
         <w:t xml:space="preserve"> Windows • Linux • TCP/IP • DNS • PCAP/EVTX analysis • Python • PowerShell • Git • MITRE ATT&amp;CK • NIST incident-response concepts</w:t>
       </w:r>
@@ -176,7 +176,79 @@
           <w:color w:val="17365D"/>
           <w:sz w:val="21"/>
         </w:rPr>
-        <w:t>CYBERSECURITY PROJECTS</w:t>
+        <w:t>CYBERSECURITY PROJECTS — HANDS-ON LABS</w:t>
+      </w:r>
+    </w:p>
+    <w:p>
+      <w:pPr>
+        <w:keepNext/>
+        <w:spacing w:before="50" w:after="10"/>
+      </w:pPr>
+      <w:r>
+        <w:rPr>
+          <w:rFonts w:ascii="Arial" w:hAnsi="Arial"/>
+          <w:b/>
+          <w:color w:val="1F2937"/>
+          <w:sz w:val="19"/>
+        </w:rPr>
+        <w:t>AI-Assisted Cloud SOC &amp; Incident Response Lab</w:t>
+      </w:r>
+      <w:r>
+        <w:rPr>
+          <w:rFonts w:ascii="Arial" w:hAnsi="Arial"/>
+          <w:i/>
+          <w:color w:val="4B5563"/>
+          <w:sz w:val="18"/>
+        </w:rPr>
+        <w:t xml:space="preserve">  |  Google Cloud • Wazuh • Tailscale • Python • SQLite</w:t>
+      </w:r>
+    </w:p>
+    <w:p>
+      <w:pPr>
+        <w:pStyle w:val="ListBullet"/>
+        <w:keepLines/>
+        <w:spacing w:before="0" w:after="24" w:line="240" w:lineRule="auto"/>
+        <w:ind w:left="245" w:hanging="187"/>
+      </w:pPr>
+      <w:r>
+        <w:rPr>
+          <w:rFonts w:ascii="Arial" w:hAnsi="Arial"/>
+          <w:color w:val="1F2937"/>
+          <w:sz w:val="21"/>
+        </w:rPr>
+        <w:t>Connected a Google Cloud Ubuntu endpoint to Wazuh over Tailscale; built a Python/FastAPI integration that persists raw alerts and incident timelines in SQLite and delivers THOTH-assisted triage to Telegram.</w:t>
+      </w:r>
+    </w:p>
+    <w:p>
+      <w:pPr>
+        <w:pStyle w:val="ListBullet"/>
+        <w:keepLines/>
+        <w:spacing w:before="0" w:after="24" w:line="240" w:lineRule="auto"/>
+        <w:ind w:left="245" w:hanging="187"/>
+      </w:pPr>
+      <w:r>
+        <w:rPr>
+          <w:rFonts w:ascii="Arial" w:hAnsi="Arial"/>
+          <w:color w:val="1F2937"/>
+          <w:sz w:val="21"/>
+        </w:rPr>
+        <w:t>Validated authentication, sudo, account creation/deletion, and file-activity detections through controlled exercises; reviewed a 41-event incident timeline and separated observed evidence from investigative hypotheses.</w:t>
+      </w:r>
+    </w:p>
+    <w:p>
+      <w:pPr>
+        <w:pStyle w:val="ListBullet"/>
+        <w:keepLines/>
+        <w:spacing w:before="0" w:after="24" w:line="240" w:lineRule="auto"/>
+        <w:ind w:left="245" w:hanging="187"/>
+      </w:pPr>
+      <w:r>
+        <w:rPr>
+          <w:rFonts w:ascii="Arial" w:hAnsi="Arial"/>
+          <w:color w:val="1F2937"/>
+          <w:sz w:val="21"/>
+        </w:rPr>
+        <w:t>Implemented persistent incident IDs, four lifecycle states, 15-minute correlation, and a 60-second quiet period; identified cross-host correlation limitations and retained human approval for remediation.</w:t>
       </w:r>
     </w:p>
     <w:p>
@@ -214,7 +286,7 @@
         <w:rPr>
           <w:rFonts w:ascii="Arial" w:hAnsi="Arial"/>
           <w:color w:val="1F2937"/>
-          <w:sz w:val="18"/>
+          <w:sz w:val="21"/>
         </w:rPr>
         <w:t>Developed and hardened three defensive analyst tools for PCAP profiling, Windows event-log triage, and safe JavaScript unpacking; treated recovered data as attacker-controlled input.</w:t>
       </w:r>
@@ -230,7 +302,7 @@
         <w:rPr>
           <w:rFonts w:ascii="Arial" w:hAnsi="Arial"/>
           <w:color w:val="1F2937"/>
-          <w:sz w:val="18"/>
+          <w:sz w:val="21"/>
         </w:rPr>
         <w:t>Added 79 automated tests, 91% core coverage for Eval Unpacker, clean-wheel installation checks, dependency auditing, secret scanning, and multi-version CI across Python 3.9–3.13.</w:t>
       </w:r>
@@ -246,7 +318,7 @@
         <w:rPr>
           <w:rFonts w:ascii="Arial" w:hAnsi="Arial"/>
           <w:color w:val="1F2937"/>
-          <w:sz w:val="18"/>
+          <w:sz w:val="21"/>
         </w:rPr>
         <w:t>Corrected analytical accuracy, secured HTML reporting, bounded hostile-input processing, and documented evidence provenance through reviewable GitHub pull requests.</w:t>
       </w:r>
@@ -263,7 +335,7 @@
           <w:color w:val="1F2937"/>
           <w:sz w:val="19"/>
         </w:rPr>
-        <w:t>SOC / Detection &amp; Response Lab</w:t>
+        <w:t>Microsoft Sentinel / Defender Detection &amp; Response Lab</w:t>
       </w:r>
       <w:r>
         <w:rPr>
@@ -272,7 +344,7 @@
           <w:color w:val="4B5563"/>
           <w:sz w:val="18"/>
         </w:rPr>
-        <w:t xml:space="preserve">  |  Sentinel • Defender • Wazuh • KQL • PowerShell • Python</w:t>
+        <w:t xml:space="preserve">  |  Azure • KQL • Log Analytics • Logic Apps</w:t>
       </w:r>
     </w:p>
     <w:p>
@@ -286,9 +358,9 @@
         <w:rPr>
           <w:rFonts w:ascii="Arial" w:hAnsi="Arial"/>
           <w:color w:val="1F2937"/>
-          <w:sz w:val="18"/>
+          <w:sz w:val="21"/>
         </w:rPr>
-        <w:t>Built a hands-on SOC lab that integrates Wazuh, Microsoft Sentinel, Microsoft Defender, KQL, PowerShell, and Python for monitoring and response exercises.</w:t>
+        <w:t>Configured Azure log ingestion and KQL analytics to investigate security activity and detect suspicious Network Security Group rule changes.</w:t>
       </w:r>
     </w:p>
     <w:p>
@@ -302,25 +374,32 @@
         <w:rPr>
           <w:rFonts w:ascii="Arial" w:hAnsi="Arial"/>
           <w:color w:val="1F2937"/>
-          <w:sz w:val="18"/>
+          <w:sz w:val="21"/>
         </w:rPr>
-        <w:t>Investigated alerts and analyzed endpoint and network telemetry through threat hunts, incident-response exercises, and detection tuning.</w:t>
+        <w:t>Generated controlled incidents and tested a Logic Apps playbook; documented triage context, query logic, and validation evidence.</w:t>
+      </w:r>
+    </w:p>
+    <w:p>
+      <w:r>
+        <w:br w:type="page"/>
       </w:r>
     </w:p>
     <w:p>
       <w:pPr>
-        <w:pStyle w:val="ListBullet"/>
-        <w:keepLines/>
-        <w:spacing w:before="0" w:after="24" w:line="240" w:lineRule="auto"/>
-        <w:ind w:left="245" w:hanging="187"/>
+        <w:keepNext/>
+        <w:spacing w:before="100" w:after="40"/>
+        <w:pBdr>
+          <w:bottom w:val="single" w:sz="8" w:space="2" w:color="17365D"/>
+        </w:pBdr>
       </w:pPr>
       <w:r>
         <w:rPr>
           <w:rFonts w:ascii="Arial" w:hAnsi="Arial"/>
-          <w:color w:val="1F2937"/>
-          <w:sz w:val="18"/>
+          <w:b/>
+          <w:color w:val="17365D"/>
+          <w:sz w:val="21"/>
         </w:rPr>
-        <w:t>Published investigation notes, detection logic, and validation evidence on GitHub; used GitHub Actions to enforce quality checks.</w:t>
+        <w:t>ADDITIONAL SOC &amp; SECURITY LABS</w:t>
       </w:r>
     </w:p>
     <w:p>
@@ -358,7 +437,7 @@
         <w:rPr>
           <w:rFonts w:ascii="Arial" w:hAnsi="Arial"/>
           <w:color w:val="1F2937"/>
-          <w:sz w:val="18"/>
+          <w:sz w:val="21"/>
         </w:rPr>
         <w:t>Deployed and managed Wazuh for endpoint monitoring, centralized log analysis, file-integrity monitoring, vulnerability detection, and security-event investigation.</w:t>
       </w:r>
@@ -374,7 +453,7 @@
         <w:rPr>
           <w:rFonts w:ascii="Arial" w:hAnsi="Arial"/>
           <w:color w:val="1F2937"/>
-          <w:sz w:val="18"/>
+          <w:sz w:val="21"/>
         </w:rPr>
         <w:t>Generated controlled security activity to validate alert coverage, investigate telemetry, and rehearse SIEM triage workflows.</w:t>
       </w:r>
@@ -390,7 +469,7 @@
         <w:rPr>
           <w:rFonts w:ascii="Arial" w:hAnsi="Arial"/>
           <w:color w:val="1F2937"/>
-          <w:sz w:val="18"/>
+          <w:sz w:val="21"/>
         </w:rPr>
         <w:t>Integrated VirusTotal enrichment and Action1 patch management into a detect, enrich, remediate, and validate workflow.</w:t>
       </w:r>
@@ -430,7 +509,7 @@
         <w:rPr>
           <w:rFonts w:ascii="Arial" w:hAnsi="Arial"/>
           <w:color w:val="1F2937"/>
-          <w:sz w:val="18"/>
+          <w:sz w:val="21"/>
         </w:rPr>
         <w:t>Configured and tested an ESP32-based platform for authorized Wi-Fi, Bluetooth, NFC, and IoT security assessments.</w:t>
       </w:r>
@@ -446,7 +525,7 @@
         <w:rPr>
           <w:rFonts w:ascii="Arial" w:hAnsi="Arial"/>
           <w:color w:val="1F2937"/>
-          <w:sz w:val="18"/>
+          <w:sz w:val="21"/>
         </w:rPr>
         <w:t>Conducted wireless reconnaissance, BLE device analysis, service enumeration, and network discovery in controlled environments.</w:t>
       </w:r>
@@ -462,7 +541,7 @@
         <w:rPr>
           <w:rFonts w:ascii="Arial" w:hAnsi="Arial"/>
           <w:color w:val="1F2937"/>
-          <w:sz w:val="18"/>
+          <w:sz w:val="21"/>
         </w:rPr>
         <w:t>Logged and analyzed wireless security data to support assessment findings and technical reporting.</w:t>
       </w:r>
@@ -520,7 +599,7 @@
         <w:rPr>
           <w:rFonts w:ascii="Arial" w:hAnsi="Arial"/>
           <w:color w:val="1F2937"/>
-          <w:sz w:val="18"/>
+          <w:sz w:val="21"/>
         </w:rPr>
         <w:t>Lead and train teams of up to 12 personnel during time-sensitive operations, prioritizing risk, accountability, communication, and mission continuity.</w:t>
       </w:r>
@@ -536,7 +615,7 @@
         <w:rPr>
           <w:rFonts w:ascii="Arial" w:hAnsi="Arial"/>
           <w:color w:val="1F2937"/>
-          <w:sz w:val="18"/>
+          <w:sz w:val="21"/>
         </w:rPr>
         <w:t>Coordinate secure movement of sensitive equipment and maintain chain-of-custody, inspection, and operational records in policy-controlled environments.</w:t>
       </w:r>
@@ -552,7 +631,7 @@
         <w:rPr>
           <w:rFonts w:ascii="Arial" w:hAnsi="Arial"/>
           <w:color w:val="1F2937"/>
-          <w:sz w:val="18"/>
+          <w:sz w:val="21"/>
         </w:rPr>
         <w:t>Conduct risk assessments, develop mitigation plans, and reinforce OPSEC, access-control awareness, and incident-reporting procedures.</w:t>
       </w:r>
@@ -592,7 +671,7 @@
         <w:rPr>
           <w:rFonts w:ascii="Arial" w:hAnsi="Arial"/>
           <w:color w:val="1F2937"/>
-          <w:sz w:val="18"/>
+          <w:sz w:val="21"/>
         </w:rPr>
         <w:t>Manage transport of sensitive ammunition and equipment while maintaining accurate documentation, chain-of-custody integrity, and regulatory compliance.</w:t>
       </w:r>
@@ -608,7 +687,7 @@
         <w:rPr>
           <w:rFonts w:ascii="Arial" w:hAnsi="Arial"/>
           <w:color w:val="1F2937"/>
-          <w:sz w:val="18"/>
+          <w:sz w:val="21"/>
         </w:rPr>
         <w:t>Perform daily asset verification and coordinate with cross-functional teams to resolve discrepancies and sustain operational readiness.</w:t>
       </w:r>
@@ -664,7 +743,7 @@
           <w:rFonts w:ascii="Arial" w:hAnsi="Arial"/>
           <w:b/>
           <w:color w:val="1F2937"/>
-          <w:sz w:val="18"/>
+          <w:sz w:val="21"/>
         </w:rPr>
         <w:t>Certification:</w:t>
       </w:r>
@@ -672,7 +751,7 @@
         <w:rPr>
           <w:rFonts w:ascii="Arial" w:hAnsi="Arial"/>
           <w:color w:val="1F2937"/>
-          <w:sz w:val="18"/>
+          <w:sz w:val="21"/>
         </w:rPr>
         <w:t xml:space="preserve"> ISC2 Certified in Cybersecurity (CC) • SOC Analyst Learning Path, LetsDefend (completed 2025)</w:t>
       </w:r>
@@ -686,7 +765,7 @@
           <w:rFonts w:ascii="Arial" w:hAnsi="Arial"/>
           <w:b/>
           <w:color w:val="1F2937"/>
-          <w:sz w:val="18"/>
+          <w:sz w:val="21"/>
         </w:rPr>
         <w:t>Additional:</w:t>
       </w:r>
@@ -694,7 +773,7 @@
         <w:rPr>
           <w:rFonts w:ascii="Arial" w:hAnsi="Arial"/>
           <w:color w:val="1F2937"/>
-          <w:sz w:val="18"/>
+          <w:sz w:val="21"/>
         </w:rPr>
         <w:t xml:space="preserve"> Secret security clearance • 20+ simulated SOC incidents investigated and documented</w:t>
       </w:r>
@@ -1099,7 +1178,7 @@
     <w:rPr>
       <w:rFonts w:ascii="Arial" w:hAnsi="Arial"/>
       <w:color w:val="1F2937"/>
-      <w:sz w:val="18"/>
+      <w:sz w:val="21"/>
     </w:rPr>
   </w:style>
   <w:style w:type="paragraph" w:styleId="Header">

</xml_diff>